<commit_message>
Add static Contents section to DES Y6 analysis memo.
Same fix as the onboarding plan: pandoc's --toc generates an empty Word
TOC field that only renders after manual refresh in Word and is invisible
in LibreOffice/Google Docs. Inject a static Markdown TOC after the
source-paper citation using pandoc-native heading IDs so all 29 entries
(sections + subsections) resolve as clickable hyperlinks immediately.

Co-Authored-By: Claude Opus 4.7 (1M context) <noreply@anthropic.com>
</commit_message>
<xml_diff>
--- a/papers/Abbott_DES_Y6_Analysis_for_Huang_Lensing_and_SpectrumFM.docx
+++ b/papers/Abbott_DES_Y6_Analysis_for_Huang_Lensing_and_SpectrumFM.docx
@@ -52,7 +52,7 @@
         </w:p>
       </w:sdtContent>
     </w:sdt>
-    <w:bookmarkStart w:id="55" w:name="des-y6-dynamical-dark-energy"/>
+    <w:bookmarkStart w:id="56" w:name="des-y6-dynamical-dark-energy"/>
     <w:p>
       <w:pPr>
         <w:pStyle w:val="Heading1"/>
@@ -126,315 +126,13 @@
       </w:r>
     </w:p>
     <w:bookmarkEnd w:id="20"/>
-    <w:bookmarkStart w:id="21" w:name="X102b2e9de4183984340b81b0bb402a984d3925a"/>
+    <w:bookmarkStart w:id="21" w:name="contents"/>
     <w:p>
       <w:pPr>
         <w:pStyle w:val="Heading2"/>
       </w:pPr>
       <w:r>
-        <w:t xml:space="preserve">1. Executive Summary</w:t>
-      </w:r>
-    </w:p>
-    <w:p>
-      <w:pPr>
-        <w:pStyle w:val="FirstParagraph"/>
-      </w:pPr>
-      <w:r>
-        <w:rPr>
-          <w:bCs/>
-          <w:b/>
-        </w:rPr>
-        <w:t xml:space="preserve">The DES result.</w:t>
-      </w:r>
-      <w:r>
-        <w:t xml:space="preserve"> </w:t>
-      </w:r>
-      <w:r>
-        <w:t xml:space="preserve">Combining the full six-year DES dataset (cosmic shear + galaxy–galaxy lensing + galaxy clustering, type Ia supernovae, and baryon acoustic oscillations) with DESI DR2 BAO and primary CMB anisotropies (Planck + ACT DR6 + SPT-3G DR1) yields a CPL-parameterized dark-energy equation of state</w:t>
-      </w:r>
-    </w:p>
-    <w:p>
-      <w:pPr>
-        <w:pStyle w:val="BlockText"/>
-      </w:pPr>
-      <w:r>
-        <w:rPr>
-          <w:iCs/>
-          <w:i/>
-        </w:rPr>
-        <w:t xml:space="preserve">w</w:t>
-      </w:r>
-      <w:r>
-        <w:t xml:space="preserve">₀ = −0.82 ± 0.05,  </w:t>
-      </w:r>
-      <w:r>
-        <w:t xml:space="preserve"> </w:t>
-      </w:r>
-      <w:r>
-        <w:rPr>
-          <w:iCs/>
-          <w:i/>
-        </w:rPr>
-        <w:t xml:space="preserve">w</w:t>
-      </w:r>
-      <w:r>
-        <w:t xml:space="preserve">ₐ = −0.63⁺⁰·²¹₋₀.₁₈,</w:t>
-      </w:r>
-    </w:p>
-    <w:p>
-      <w:pPr>
-        <w:pStyle w:val="FirstParagraph"/>
-      </w:pPr>
-      <w:r>
-        <w:t xml:space="preserve">a</w:t>
-      </w:r>
-      <w:r>
-        <w:t xml:space="preserve"> </w:t>
-      </w:r>
-      <w:r>
-        <w:rPr>
-          <w:bCs/>
-          <w:b/>
-        </w:rPr>
-        <w:t xml:space="preserve">3.0 σ departure</w:t>
-      </w:r>
-      <w:r>
-        <w:t xml:space="preserve"> </w:t>
-      </w:r>
-      <w:r>
-        <w:t xml:space="preserve">from the cosmological constant (</w:t>
-      </w:r>
-      <w:r>
-        <w:rPr>
-          <w:iCs/>
-          <w:i/>
-        </w:rPr>
-        <w:t xml:space="preserve">w</w:t>
-      </w:r>
-      <w:r>
-        <w:t xml:space="preserve">₀,</w:t>
-      </w:r>
-      <w:r>
-        <w:t xml:space="preserve"> </w:t>
-      </w:r>
-      <w:r>
-        <w:rPr>
-          <w:iCs/>
-          <w:i/>
-        </w:rPr>
-        <w:t xml:space="preserve">w</w:t>
-      </w:r>
-      <w:r>
-        <w:t xml:space="preserve">ₐ) = (−1, 0). The DES-only multi-probe combination already shows 2.2 σ, and the low-redshift-only combination (no CMB) shows 2.3 σ. Leaving out any single probe class still produces 2.3 σ–3.2 σ; the best-fit always lives in the</w:t>
-      </w:r>
-      <w:r>
-        <w:t xml:space="preserve"> </w:t>
-      </w:r>
-      <w:r>
-        <w:rPr>
-          <w:iCs/>
-          <w:i/>
-        </w:rPr>
-        <w:t xml:space="preserve">w</w:t>
-      </w:r>
-      <w:r>
-        <w:t xml:space="preserve">₀ &gt; −1,</w:t>
-      </w:r>
-      <w:r>
-        <w:t xml:space="preserve"> </w:t>
-      </w:r>
-      <w:r>
-        <w:rPr>
-          <w:iCs/>
-          <w:i/>
-        </w:rPr>
-        <w:t xml:space="preserve">w</w:t>
-      </w:r>
-      <w:r>
-        <w:t xml:space="preserve">ₐ &lt; 0 quadrant — the so-called "phantom-crossing" region that single-field quintessence cannot reach. This is consistent with, and now appreciably tighter than, the earlier DESI DR1, DESI DR2, and DES-SN-only hints.</w:t>
-      </w:r>
-    </w:p>
-    <w:p>
-      <w:pPr>
-        <w:pStyle w:val="BodyText"/>
-      </w:pPr>
-      <w:r>
-        <w:rPr>
-          <w:bCs/>
-          <w:b/>
-        </w:rPr>
-        <w:t xml:space="preserve">Why it matters for Huang's program.</w:t>
-      </w:r>
-      <w:r>
-        <w:t xml:space="preserve"> </w:t>
-      </w:r>
-      <w:r>
-        <w:t xml:space="preserve">The DES paper is, in effect, a public demonstration that</w:t>
-      </w:r>
-      <w:r>
-        <w:t xml:space="preserve"> </w:t>
-      </w:r>
-      <w:r>
-        <w:rPr>
-          <w:iCs/>
-          <w:i/>
-        </w:rPr>
-        <w:t xml:space="preserve">multiplying late-time probes</w:t>
-      </w:r>
-      <w:r>
-        <w:t xml:space="preserve"> </w:t>
-      </w:r>
-      <w:r>
-        <w:t xml:space="preserve">is how the dark-energy question now advances: adding 3×2pt weak lensing to SN+DESI-BAO</w:t>
-      </w:r>
-      <w:r>
-        <w:t xml:space="preserve"> </w:t>
-      </w:r>
-      <w:r>
-        <w:rPr>
-          <w:bCs/>
-          <w:b/>
-        </w:rPr>
-        <w:t xml:space="preserve">doubles</w:t>
-      </w:r>
-      <w:r>
-        <w:t xml:space="preserve"> </w:t>
-      </w:r>
-      <w:r>
-        <w:t xml:space="preserve">the dark-energy figure of merit (FoM 61 → 110). Strong-lens cosmography is statistically independent of cosmic-shear 3×2pt and statistically independent of SN photometric calibration — the two probes that anchor the DES Y6 result. Huang's program is positioned to deliver three distinct late-time probes (lensed-quasar time delays, lensed-SN Ia time delays, and static-lens</w:t>
-      </w:r>
-      <w:r>
-        <w:t xml:space="preserve"> </w:t>
-      </w:r>
-      <w:r>
-        <w:rPr>
-          <w:iCs/>
-          <w:i/>
-        </w:rPr>
-        <w:t xml:space="preserve">θ</w:t>
-      </w:r>
-      <w:r>
-        <w:t xml:space="preserve">ₑ–</w:t>
-      </w:r>
-      <w:r>
-        <w:rPr>
-          <w:iCs/>
-          <w:i/>
-        </w:rPr>
-        <w:t xml:space="preserve">σᵥ</w:t>
-      </w:r>
-      <w:r>
-        <w:t xml:space="preserve"> </w:t>
-      </w:r>
-      <w:r>
-        <w:t xml:space="preserve">statistics), all of which were named as future contributions in the introductions of</w:t>
-      </w:r>
-      <w:r>
-        <w:t xml:space="preserve"> </w:t>
-      </w:r>
-      <w:r>
-        <w:rPr>
-          <w:iCs/>
-          <w:i/>
-        </w:rPr>
-        <w:t xml:space="preserve">Foundry I</w:t>
-      </w:r>
-      <w:r>
-        <w:t xml:space="preserve"> </w:t>
-      </w:r>
-      <w:r>
-        <w:t xml:space="preserve">(Huang et al. 2025a) and</w:t>
-      </w:r>
-      <w:r>
-        <w:t xml:space="preserve"> </w:t>
-      </w:r>
-      <w:r>
-        <w:rPr>
-          <w:iCs/>
-          <w:i/>
-        </w:rPr>
-        <w:t xml:space="preserve">GIGA-Lens</w:t>
-      </w:r>
-      <w:r>
-        <w:t xml:space="preserve"> </w:t>
-      </w:r>
-      <w:r>
-        <w:t xml:space="preserve">(Gu et al. 2022) but none of which has yet flowed through to a</w:t>
-      </w:r>
-      <w:r>
-        <w:t xml:space="preserve"> </w:t>
-      </w:r>
-      <w:r>
-        <w:rPr>
-          <w:iCs/>
-          <w:i/>
-        </w:rPr>
-        <w:t xml:space="preserve">w</w:t>
-      </w:r>
-      <w:r>
-        <w:t xml:space="preserve">₀wₐ constraint paper. The DES Y6 result raises the strategic value of closing that gap.</w:t>
-      </w:r>
-    </w:p>
-    <w:p>
-      <w:pPr>
-        <w:pStyle w:val="BodyText"/>
-      </w:pPr>
-      <w:r>
-        <w:rPr>
-          <w:bCs/>
-          <w:b/>
-        </w:rPr>
-        <w:t xml:space="preserve">Why it matters for SpectrumFM.</w:t>
-      </w:r>
-      <w:r>
-        <w:t xml:space="preserve"> </w:t>
-      </w:r>
-      <w:r>
-        <w:t xml:space="preserve">The SpectrumFM proposal (v7) opens with "Massive spectroscopic surveys … are the backbone of precision cosmology, providing the data to map the universe's structure and constrain dark energy" but then never names BAO,</w:t>
-      </w:r>
-      <w:r>
-        <w:t xml:space="preserve"> </w:t>
-      </w:r>
-      <w:r>
-        <w:rPr>
-          <w:iCs/>
-          <w:i/>
-        </w:rPr>
-        <w:t xml:space="preserve">w</w:t>
-      </w:r>
-      <w:r>
-        <w:t xml:space="preserve">₀,</w:t>
-      </w:r>
-      <w:r>
-        <w:t xml:space="preserve"> </w:t>
-      </w:r>
-      <w:r>
-        <w:rPr>
-          <w:iCs/>
-          <w:i/>
-        </w:rPr>
-        <w:t xml:space="preserve">w</w:t>
-      </w:r>
-      <w:r>
-        <w:t xml:space="preserve">ₐ, CPL, or SN cosmology again. After DES Y6, the proposal sits at the operational center of the most informative late-time dark-energy stack — LRG/QSO redshifts feed DESI-DR2 BAO; SN typing feeds the Stage-IV SN Ia pipeline; lens identification (already in the proposal via the Hsu 2025 pairwise method) feeds two of the three strong-lens cosmography paths. None of these connections are made explicit in the current narrative. They should be.</w:t>
-      </w:r>
-    </w:p>
-    <w:p>
-      <w:pPr>
-        <w:pStyle w:val="BodyText"/>
-      </w:pPr>
-      <w:r>
-        <w:rPr>
-          <w:bCs/>
-          <w:b/>
-        </w:rPr>
-        <w:t xml:space="preserve">Recommended near-term actions</w:t>
-      </w:r>
-      <w:r>
-        <w:t xml:space="preserve"> </w:t>
-      </w:r>
-      <w:r>
-        <w:t xml:space="preserve">(developed in §9):</w:t>
+        <w:t xml:space="preserve">Contents</w:t>
       </w:r>
     </w:p>
     <w:p>
@@ -445,38 +143,14 @@
         </w:numPr>
         <w:pStyle w:val="Compact"/>
       </w:pPr>
-      <w:r>
-        <w:t xml:space="preserve">Spin up a Li-et-al-2024-style static-lens</w:t>
-      </w:r>
-      <w:r>
-        <w:t xml:space="preserve"> </w:t>
-      </w:r>
-      <w:r>
-        <w:rPr>
-          <w:iCs/>
-          <w:i/>
-        </w:rPr>
-        <w:t xml:space="preserve">w</w:t>
-      </w:r>
-      <w:r>
-        <w:t xml:space="preserve">₀wₐ analysis on the existing ~3,500-candidate H20/H21/S24 catalog plus DESI σᵥ measurements — feasible</w:t>
-      </w:r>
-      <w:r>
-        <w:t xml:space="preserve"> </w:t>
-      </w:r>
-      <w:r>
-        <w:rPr>
-          <w:iCs/>
-          <w:i/>
-        </w:rPr>
-        <w:t xml:space="preserve">before</w:t>
-      </w:r>
-      <w:r>
-        <w:t xml:space="preserve"> </w:t>
-      </w:r>
-      <w:r>
-        <w:t xml:space="preserve">Rubin first light.</w:t>
-      </w:r>
+      <w:hyperlink w:anchor="X102b2e9de4183984340b81b0bb402a984d3925a">
+        <w:r>
+          <w:rPr>
+            <w:rStyle w:val="Hyperlink"/>
+          </w:rPr>
+          <w:t xml:space="preserve">1. Executive Summary</w:t>
+        </w:r>
+      </w:hyperlink>
     </w:p>
     <w:p>
       <w:pPr>
@@ -486,9 +160,116 @@
         </w:numPr>
         <w:pStyle w:val="Compact"/>
       </w:pPr>
-      <w:r>
-        <w:t xml:space="preserve">Convert GIGA-Lens into a hierarchical Bayesian framework that yields population-level cosmological posteriors.</w:t>
-      </w:r>
+      <w:hyperlink w:anchor="X0fa768a53ed4ef65fe797a009f4fe6167b1c206">
+        <w:r>
+          <w:rPr>
+            <w:rStyle w:val="Hyperlink"/>
+          </w:rPr>
+          <w:t xml:space="preserve">2. The DES Y6 Paper in Detail</w:t>
+        </w:r>
+      </w:hyperlink>
+    </w:p>
+    <w:p>
+      <w:pPr>
+        <w:numPr>
+          <w:ilvl w:val="1"/>
+          <w:numId w:val="1002"/>
+        </w:numPr>
+        <w:pStyle w:val="Compact"/>
+      </w:pPr>
+      <w:hyperlink w:anchor="X51ed9f6223fba081081d3e2fa012158883ed051">
+        <w:r>
+          <w:rPr>
+            <w:rStyle w:val="Hyperlink"/>
+          </w:rPr>
+          <w:t xml:space="preserve">2.1 What is being measured</w:t>
+        </w:r>
+      </w:hyperlink>
+    </w:p>
+    <w:p>
+      <w:pPr>
+        <w:numPr>
+          <w:ilvl w:val="1"/>
+          <w:numId w:val="1002"/>
+        </w:numPr>
+        <w:pStyle w:val="Compact"/>
+      </w:pPr>
+      <w:hyperlink w:anchor="Xcc581b61d80bd7a0d88d814cc96c91febec596d">
+        <w:r>
+          <w:rPr>
+            <w:rStyle w:val="Hyperlink"/>
+          </w:rPr>
+          <w:t xml:space="preserve">2.2 The four probes</w:t>
+        </w:r>
+      </w:hyperlink>
+    </w:p>
+    <w:p>
+      <w:pPr>
+        <w:numPr>
+          <w:ilvl w:val="1"/>
+          <w:numId w:val="1002"/>
+        </w:numPr>
+        <w:pStyle w:val="Compact"/>
+      </w:pPr>
+      <w:hyperlink w:anchor="Xf4e9823cd816c254174387b78f815a0826912b7">
+        <w:r>
+          <w:rPr>
+            <w:rStyle w:val="Hyperlink"/>
+          </w:rPr>
+          <w:t xml:space="preserve">2.3 Headline numbers and Table I</w:t>
+        </w:r>
+      </w:hyperlink>
+    </w:p>
+    <w:p>
+      <w:pPr>
+        <w:numPr>
+          <w:ilvl w:val="1"/>
+          <w:numId w:val="1002"/>
+        </w:numPr>
+        <w:pStyle w:val="Compact"/>
+      </w:pPr>
+      <w:hyperlink w:anchor="X1ab736f7342c7625289a692ecdd7693433762e0">
+        <w:r>
+          <w:rPr>
+            <w:rStyle w:val="Hyperlink"/>
+          </w:rPr>
+          <w:t xml:space="preserve">2.4 Phantom-crossing and what it means</w:t>
+        </w:r>
+      </w:hyperlink>
+    </w:p>
+    <w:p>
+      <w:pPr>
+        <w:numPr>
+          <w:ilvl w:val="1"/>
+          <w:numId w:val="1002"/>
+        </w:numPr>
+        <w:pStyle w:val="Compact"/>
+      </w:pPr>
+      <w:hyperlink w:anchor="X66e700142e08d48bd09992bde3cdaca2f13ea32">
+        <w:r>
+          <w:rPr>
+            <w:rStyle w:val="Hyperlink"/>
+          </w:rPr>
+          <w:t xml:space="preserve">2.5 Robustness and caveats</w:t>
+        </w:r>
+      </w:hyperlink>
+    </w:p>
+    <w:p>
+      <w:pPr>
+        <w:numPr>
+          <w:ilvl w:val="1"/>
+          <w:numId w:val="1002"/>
+        </w:numPr>
+        <w:pStyle w:val="Compact"/>
+      </w:pPr>
+      <w:hyperlink w:anchor="Xea0987aff34b7a58b5dc2da9c26d5dd5fcb687d">
+        <w:r>
+          <w:rPr>
+            <w:rStyle w:val="Hyperlink"/>
+          </w:rPr>
+          <w:t xml:space="preserve">2.6 The S₈ "tension" addendum (Supplemental Material Fig. S1)</w:t>
+        </w:r>
+      </w:hyperlink>
     </w:p>
     <w:p>
       <w:pPr>
@@ -498,9 +279,65 @@
         </w:numPr>
         <w:pStyle w:val="Compact"/>
       </w:pPr>
-      <w:r>
-        <w:t xml:space="preserve">Add a dark-energy section to the SpectrumFM v8 narrative covering BAO redshift purity, SN typing, σᵥ regression, and lens identification — with quantified expected gains.</w:t>
-      </w:r>
+      <w:hyperlink w:anchor="Xebde256e9027d29b1c0425ec6675ee97ddd6a0a">
+        <w:r>
+          <w:rPr>
+            <w:rStyle w:val="Hyperlink"/>
+          </w:rPr>
+          <w:t xml:space="preserve">3. Huang's Strong-Lensing Program</w:t>
+        </w:r>
+      </w:hyperlink>
+    </w:p>
+    <w:p>
+      <w:pPr>
+        <w:numPr>
+          <w:ilvl w:val="1"/>
+          <w:numId w:val="1003"/>
+        </w:numPr>
+        <w:pStyle w:val="Compact"/>
+      </w:pPr>
+      <w:hyperlink w:anchor="X70c6673cca24741713ea1a89101f0eb081c853c">
+        <w:r>
+          <w:rPr>
+            <w:rStyle w:val="Hyperlink"/>
+          </w:rPr>
+          <w:t xml:space="preserve">3.1 The program at a glance</w:t>
+        </w:r>
+      </w:hyperlink>
+    </w:p>
+    <w:p>
+      <w:pPr>
+        <w:numPr>
+          <w:ilvl w:val="1"/>
+          <w:numId w:val="1003"/>
+        </w:numPr>
+        <w:pStyle w:val="Compact"/>
+      </w:pPr>
+      <w:hyperlink w:anchor="Xab570876923bf7eef5619d3d9479fae32379df1">
+        <w:r>
+          <w:rPr>
+            <w:rStyle w:val="Hyperlink"/>
+          </w:rPr>
+          <w:t xml:space="preserve">3.2 The cosmographic outputs the program is positioned to deliver</w:t>
+        </w:r>
+      </w:hyperlink>
+    </w:p>
+    <w:p>
+      <w:pPr>
+        <w:numPr>
+          <w:ilvl w:val="1"/>
+          <w:numId w:val="1003"/>
+        </w:numPr>
+        <w:pStyle w:val="Compact"/>
+      </w:pPr>
+      <w:hyperlink w:anchor="X198a4ad912a23f3e1b418664d58e07a5325520e">
+        <w:r>
+          <w:rPr>
+            <w:rStyle w:val="Hyperlink"/>
+          </w:rPr>
+          <w:t xml:space="preserve">3.3 The current center of mass of the program is Discover + Characterize, not Cosmologize</w:t>
+        </w:r>
+      </w:hyperlink>
     </w:p>
     <w:p>
       <w:pPr>
@@ -510,9 +347,65 @@
         </w:numPr>
         <w:pStyle w:val="Compact"/>
       </w:pPr>
-      <w:r>
-        <w:t xml:space="preserve">Move the Sheu 2023 lensed-SN pipeline from retrospective to live triggering, gated by a SpectrumFM SN-type classifier on host-galaxy spectra.</w:t>
-      </w:r>
+      <w:hyperlink w:anchor="Xcbc2c46850cf541de8056ba2026fc3a862993fa">
+        <w:r>
+          <w:rPr>
+            <w:rStyle w:val="Hyperlink"/>
+          </w:rPr>
+          <w:t xml:space="preserve">4. Implications for Huang's Work</w:t>
+        </w:r>
+      </w:hyperlink>
+    </w:p>
+    <w:p>
+      <w:pPr>
+        <w:numPr>
+          <w:ilvl w:val="1"/>
+          <w:numId w:val="1004"/>
+        </w:numPr>
+        <w:pStyle w:val="Compact"/>
+      </w:pPr>
+      <w:hyperlink w:anchor="X5562bd9ac4d6b7c9de413245fab8e96ab63f39f">
+        <w:r>
+          <w:rPr>
+            <w:rStyle w:val="Hyperlink"/>
+          </w:rPr>
+          <w:t xml:space="preserve">4.1 The DES result validates the strategic value of the lensing pillar</w:t>
+        </w:r>
+      </w:hyperlink>
+    </w:p>
+    <w:p>
+      <w:pPr>
+        <w:numPr>
+          <w:ilvl w:val="1"/>
+          <w:numId w:val="1004"/>
+        </w:numPr>
+        <w:pStyle w:val="Compact"/>
+      </w:pPr>
+      <w:hyperlink w:anchor="X84586f264e56c05d03cf99a870206894949c446">
+        <w:r>
+          <w:rPr>
+            <w:rStyle w:val="Hyperlink"/>
+          </w:rPr>
+          <w:t xml:space="preserve">4.2 Specific actions the group should consider</w:t>
+        </w:r>
+      </w:hyperlink>
+    </w:p>
+    <w:p>
+      <w:pPr>
+        <w:numPr>
+          <w:ilvl w:val="1"/>
+          <w:numId w:val="1004"/>
+        </w:numPr>
+        <w:pStyle w:val="Compact"/>
+      </w:pPr>
+      <w:hyperlink w:anchor="X4bd22b703365ab2305e3ca8187fcdd135cd8ae8">
+        <w:r>
+          <w:rPr>
+            <w:rStyle w:val="Hyperlink"/>
+          </w:rPr>
+          <w:t xml:space="preserve">4.3 Methodological transfers the Foundry team can adopt today</w:t>
+        </w:r>
+      </w:hyperlink>
     </w:p>
     <w:p>
       <w:pPr>
@@ -522,9 +415,218 @@
         </w:numPr>
         <w:pStyle w:val="Compact"/>
       </w:pPr>
-      <w:r>
-        <w:t xml:space="preserve">Stand up the agentic coordination layer (§6) that turns these per-pipeline outputs into a continuously updated multi-probe cosmological constraint.</w:t>
-      </w:r>
+      <w:hyperlink w:anchor="X718780227a7edfbd754fb9eb98786bede1c36dc">
+        <w:r>
+          <w:rPr>
+            <w:rStyle w:val="Hyperlink"/>
+          </w:rPr>
+          <w:t xml:space="preserve">5. Implications for the SpectrumFM Proposal</w:t>
+        </w:r>
+      </w:hyperlink>
+    </w:p>
+    <w:p>
+      <w:pPr>
+        <w:numPr>
+          <w:ilvl w:val="1"/>
+          <w:numId w:val="1005"/>
+        </w:numPr>
+        <w:pStyle w:val="Compact"/>
+      </w:pPr>
+      <w:hyperlink w:anchor="X1ead1f00ec000540f2b1041645dd26b3356e2a1">
+        <w:r>
+          <w:rPr>
+            <w:rStyle w:val="Hyperlink"/>
+          </w:rPr>
+          <w:t xml:space="preserve">5.1 The strategic gap</w:t>
+        </w:r>
+      </w:hyperlink>
+    </w:p>
+    <w:p>
+      <w:pPr>
+        <w:numPr>
+          <w:ilvl w:val="1"/>
+          <w:numId w:val="1005"/>
+        </w:numPr>
+        <w:pStyle w:val="Compact"/>
+      </w:pPr>
+      <w:hyperlink w:anchor="X6a559646460ed4b73b67adf93e4482944d184b6">
+        <w:r>
+          <w:rPr>
+            <w:rStyle w:val="Hyperlink"/>
+          </w:rPr>
+          <w:t xml:space="preserve">5.2 Concrete cosmological angles to add to the narrative</w:t>
+        </w:r>
+      </w:hyperlink>
+    </w:p>
+    <w:p>
+      <w:pPr>
+        <w:numPr>
+          <w:ilvl w:val="1"/>
+          <w:numId w:val="1005"/>
+        </w:numPr>
+        <w:pStyle w:val="Compact"/>
+      </w:pPr>
+      <w:hyperlink w:anchor="X9b1af6349a7d00c583c4bac906de9bf4a90c7e2">
+        <w:r>
+          <w:rPr>
+            <w:rStyle w:val="Hyperlink"/>
+          </w:rPr>
+          <w:t xml:space="preserve">5.3 Phase II Rubin / Euclid / Roman alignment</w:t>
+        </w:r>
+      </w:hyperlink>
+    </w:p>
+    <w:p>
+      <w:pPr>
+        <w:numPr>
+          <w:ilvl w:val="1"/>
+          <w:numId w:val="1005"/>
+        </w:numPr>
+        <w:pStyle w:val="Compact"/>
+      </w:pPr>
+      <w:hyperlink w:anchor="X4581e460489a31d5bfb5da1febaa0e89653d12e">
+        <w:r>
+          <w:rPr>
+            <w:rStyle w:val="Hyperlink"/>
+          </w:rPr>
+          <w:t xml:space="preserve">5.4 What the Stephen-Bailey LBNL connection makes possible</w:t>
+        </w:r>
+      </w:hyperlink>
+    </w:p>
+    <w:p>
+      <w:pPr>
+        <w:numPr>
+          <w:ilvl w:val="0"/>
+          <w:numId w:val="1001"/>
+        </w:numPr>
+        <w:pStyle w:val="Compact"/>
+      </w:pPr>
+      <w:hyperlink w:anchor="X9baecef7a3b1d08b519baa3e654edd8bba85ff4">
+        <w:r>
+          <w:rPr>
+            <w:rStyle w:val="Hyperlink"/>
+          </w:rPr>
+          <w:t xml:space="preserve">6. The Agentic-AI Layer</w:t>
+        </w:r>
+      </w:hyperlink>
+    </w:p>
+    <w:p>
+      <w:pPr>
+        <w:numPr>
+          <w:ilvl w:val="1"/>
+          <w:numId w:val="1006"/>
+        </w:numPr>
+        <w:pStyle w:val="Compact"/>
+      </w:pPr>
+      <w:hyperlink w:anchor="Xc48e3fbcf4d8f1c0532e9841cfb50991a34e0b6">
+        <w:r>
+          <w:rPr>
+            <w:rStyle w:val="Hyperlink"/>
+          </w:rPr>
+          <w:t xml:space="preserve">6.1 Why agentic coordination is the missing layer</w:t>
+        </w:r>
+      </w:hyperlink>
+    </w:p>
+    <w:p>
+      <w:pPr>
+        <w:numPr>
+          <w:ilvl w:val="1"/>
+          <w:numId w:val="1006"/>
+        </w:numPr>
+        <w:pStyle w:val="Compact"/>
+      </w:pPr>
+      <w:hyperlink w:anchor="Xd4210e200fc823263bb5766a8ab84715f41ff2d">
+        <w:r>
+          <w:rPr>
+            <w:rStyle w:val="Hyperlink"/>
+          </w:rPr>
+          <w:t xml:space="preserve">6.2 Five agent designs</w:t>
+        </w:r>
+      </w:hyperlink>
+    </w:p>
+    <w:p>
+      <w:pPr>
+        <w:numPr>
+          <w:ilvl w:val="1"/>
+          <w:numId w:val="1006"/>
+        </w:numPr>
+        <w:pStyle w:val="Compact"/>
+      </w:pPr>
+      <w:hyperlink w:anchor="Xfd117337217ef7b35264d000dd37b7b28740352">
+        <w:r>
+          <w:rPr>
+            <w:rStyle w:val="Hyperlink"/>
+          </w:rPr>
+          <w:t xml:space="preserve">6.3 Shared substrate</w:t>
+        </w:r>
+      </w:hyperlink>
+    </w:p>
+    <w:p>
+      <w:pPr>
+        <w:numPr>
+          <w:ilvl w:val="1"/>
+          <w:numId w:val="1006"/>
+        </w:numPr>
+        <w:pStyle w:val="Compact"/>
+      </w:pPr>
+      <w:hyperlink w:anchor="X1603b25eafd088f55e1f16d5537e2389986afc8">
+        <w:r>
+          <w:rPr>
+            <w:rStyle w:val="Hyperlink"/>
+          </w:rPr>
+          <w:t xml:space="preserve">6.4 Phasing</w:t>
+        </w:r>
+      </w:hyperlink>
+    </w:p>
+    <w:p>
+      <w:pPr>
+        <w:numPr>
+          <w:ilvl w:val="0"/>
+          <w:numId w:val="1001"/>
+        </w:numPr>
+        <w:pStyle w:val="Compact"/>
+      </w:pPr>
+      <w:hyperlink w:anchor="X835d2a0d6e8a1d531fc80c4f98a0fa58d2d2650">
+        <w:r>
+          <w:rPr>
+            <w:rStyle w:val="Hyperlink"/>
+          </w:rPr>
+          <w:t xml:space="preserve">7. What We Can Directly Use From the DES Y6 Result</w:t>
+        </w:r>
+      </w:hyperlink>
+    </w:p>
+    <w:p>
+      <w:pPr>
+        <w:numPr>
+          <w:ilvl w:val="0"/>
+          <w:numId w:val="1001"/>
+        </w:numPr>
+        <w:pStyle w:val="Compact"/>
+      </w:pPr>
+      <w:hyperlink w:anchor="X2841c217c4374be2649c2ed69808eac810642ff">
+        <w:r>
+          <w:rPr>
+            <w:rStyle w:val="Hyperlink"/>
+          </w:rPr>
+          <w:t xml:space="preserve">8. Risks and Caveats</w:t>
+        </w:r>
+      </w:hyperlink>
+    </w:p>
+    <w:p>
+      <w:pPr>
+        <w:numPr>
+          <w:ilvl w:val="0"/>
+          <w:numId w:val="1001"/>
+        </w:numPr>
+        <w:pStyle w:val="Compact"/>
+      </w:pPr>
+      <w:hyperlink w:anchor="X02b8d75d000e8790a385e3b0534f9ea3b804d5d">
+        <w:r>
+          <w:rPr>
+            <w:rStyle w:val="Hyperlink"/>
+          </w:rPr>
+          <w:t xml:space="preserve">9. Recommended Near-Term Actions</w:t>
+        </w:r>
+      </w:hyperlink>
     </w:p>
     <w:p>
       <w:r>
@@ -534,12 +636,420 @@
       </w:r>
     </w:p>
     <w:bookmarkEnd w:id="21"/>
-    <w:bookmarkStart w:id="28" w:name="X0fa768a53ed4ef65fe797a009f4fe6167b1c206"/>
+    <w:bookmarkStart w:id="22" w:name="X102b2e9de4183984340b81b0bb402a984d3925a"/>
     <w:p>
       <w:pPr>
         <w:pStyle w:val="Heading2"/>
       </w:pPr>
       <w:r>
+        <w:t xml:space="preserve">1. Executive Summary</w:t>
+      </w:r>
+    </w:p>
+    <w:p>
+      <w:pPr>
+        <w:pStyle w:val="FirstParagraph"/>
+      </w:pPr>
+      <w:r>
+        <w:rPr>
+          <w:bCs/>
+          <w:b/>
+        </w:rPr>
+        <w:t xml:space="preserve">The DES result.</w:t>
+      </w:r>
+      <w:r>
+        <w:t xml:space="preserve"> </w:t>
+      </w:r>
+      <w:r>
+        <w:t xml:space="preserve">Combining the full six-year DES dataset (cosmic shear + galaxy–galaxy lensing + galaxy clustering, type Ia supernovae, and baryon acoustic oscillations) with DESI DR2 BAO and primary CMB anisotropies (Planck + ACT DR6 + SPT-3G DR1) yields a CPL-parameterized dark-energy equation of state</w:t>
+      </w:r>
+    </w:p>
+    <w:p>
+      <w:pPr>
+        <w:pStyle w:val="BlockText"/>
+      </w:pPr>
+      <w:r>
+        <w:rPr>
+          <w:iCs/>
+          <w:i/>
+        </w:rPr>
+        <w:t xml:space="preserve">w</w:t>
+      </w:r>
+      <w:r>
+        <w:t xml:space="preserve">₀ = −0.82 ± 0.05,  </w:t>
+      </w:r>
+      <w:r>
+        <w:t xml:space="preserve"> </w:t>
+      </w:r>
+      <w:r>
+        <w:rPr>
+          <w:iCs/>
+          <w:i/>
+        </w:rPr>
+        <w:t xml:space="preserve">w</w:t>
+      </w:r>
+      <w:r>
+        <w:t xml:space="preserve">ₐ = −0.63⁺⁰·²¹₋₀.₁₈,</w:t>
+      </w:r>
+    </w:p>
+    <w:p>
+      <w:pPr>
+        <w:pStyle w:val="FirstParagraph"/>
+      </w:pPr>
+      <w:r>
+        <w:t xml:space="preserve">a</w:t>
+      </w:r>
+      <w:r>
+        <w:t xml:space="preserve"> </w:t>
+      </w:r>
+      <w:r>
+        <w:rPr>
+          <w:bCs/>
+          <w:b/>
+        </w:rPr>
+        <w:t xml:space="preserve">3.0 σ departure</w:t>
+      </w:r>
+      <w:r>
+        <w:t xml:space="preserve"> </w:t>
+      </w:r>
+      <w:r>
+        <w:t xml:space="preserve">from the cosmological constant (</w:t>
+      </w:r>
+      <w:r>
+        <w:rPr>
+          <w:iCs/>
+          <w:i/>
+        </w:rPr>
+        <w:t xml:space="preserve">w</w:t>
+      </w:r>
+      <w:r>
+        <w:t xml:space="preserve">₀,</w:t>
+      </w:r>
+      <w:r>
+        <w:t xml:space="preserve"> </w:t>
+      </w:r>
+      <w:r>
+        <w:rPr>
+          <w:iCs/>
+          <w:i/>
+        </w:rPr>
+        <w:t xml:space="preserve">w</w:t>
+      </w:r>
+      <w:r>
+        <w:t xml:space="preserve">ₐ) = (−1, 0). The DES-only multi-probe combination already shows 2.2 σ, and the low-redshift-only combination (no CMB) shows 2.3 σ. Leaving out any single probe class still produces 2.3 σ–3.2 σ; the best-fit always lives in the</w:t>
+      </w:r>
+      <w:r>
+        <w:t xml:space="preserve"> </w:t>
+      </w:r>
+      <w:r>
+        <w:rPr>
+          <w:iCs/>
+          <w:i/>
+        </w:rPr>
+        <w:t xml:space="preserve">w</w:t>
+      </w:r>
+      <w:r>
+        <w:t xml:space="preserve">₀ &gt; −1,</w:t>
+      </w:r>
+      <w:r>
+        <w:t xml:space="preserve"> </w:t>
+      </w:r>
+      <w:r>
+        <w:rPr>
+          <w:iCs/>
+          <w:i/>
+        </w:rPr>
+        <w:t xml:space="preserve">w</w:t>
+      </w:r>
+      <w:r>
+        <w:t xml:space="preserve">ₐ &lt; 0 quadrant — the so-called "phantom-crossing" region that single-field quintessence cannot reach. This is consistent with, and now appreciably tighter than, the earlier DESI DR1, DESI DR2, and DES-SN-only hints.</w:t>
+      </w:r>
+    </w:p>
+    <w:p>
+      <w:pPr>
+        <w:pStyle w:val="BodyText"/>
+      </w:pPr>
+      <w:r>
+        <w:rPr>
+          <w:bCs/>
+          <w:b/>
+        </w:rPr>
+        <w:t xml:space="preserve">Why it matters for Huang's program.</w:t>
+      </w:r>
+      <w:r>
+        <w:t xml:space="preserve"> </w:t>
+      </w:r>
+      <w:r>
+        <w:t xml:space="preserve">The DES paper is, in effect, a public demonstration that</w:t>
+      </w:r>
+      <w:r>
+        <w:t xml:space="preserve"> </w:t>
+      </w:r>
+      <w:r>
+        <w:rPr>
+          <w:iCs/>
+          <w:i/>
+        </w:rPr>
+        <w:t xml:space="preserve">multiplying late-time probes</w:t>
+      </w:r>
+      <w:r>
+        <w:t xml:space="preserve"> </w:t>
+      </w:r>
+      <w:r>
+        <w:t xml:space="preserve">is how the dark-energy question now advances: adding 3×2pt weak lensing to SN+DESI-BAO</w:t>
+      </w:r>
+      <w:r>
+        <w:t xml:space="preserve"> </w:t>
+      </w:r>
+      <w:r>
+        <w:rPr>
+          <w:bCs/>
+          <w:b/>
+        </w:rPr>
+        <w:t xml:space="preserve">doubles</w:t>
+      </w:r>
+      <w:r>
+        <w:t xml:space="preserve"> </w:t>
+      </w:r>
+      <w:r>
+        <w:t xml:space="preserve">the dark-energy figure of merit (FoM 61 → 110). Strong-lens cosmography is statistically independent of cosmic-shear 3×2pt and statistically independent of SN photometric calibration — the two probes that anchor the DES Y6 result. Huang's program is positioned to deliver three distinct late-time probes (lensed-quasar time delays, lensed-SN Ia time delays, and static-lens</w:t>
+      </w:r>
+      <w:r>
+        <w:t xml:space="preserve"> </w:t>
+      </w:r>
+      <w:r>
+        <w:rPr>
+          <w:iCs/>
+          <w:i/>
+        </w:rPr>
+        <w:t xml:space="preserve">θ</w:t>
+      </w:r>
+      <w:r>
+        <w:t xml:space="preserve">ₑ–</w:t>
+      </w:r>
+      <w:r>
+        <w:rPr>
+          <w:iCs/>
+          <w:i/>
+        </w:rPr>
+        <w:t xml:space="preserve">σᵥ</w:t>
+      </w:r>
+      <w:r>
+        <w:t xml:space="preserve"> </w:t>
+      </w:r>
+      <w:r>
+        <w:t xml:space="preserve">statistics), all of which were named as future contributions in the introductions of</w:t>
+      </w:r>
+      <w:r>
+        <w:t xml:space="preserve"> </w:t>
+      </w:r>
+      <w:r>
+        <w:rPr>
+          <w:iCs/>
+          <w:i/>
+        </w:rPr>
+        <w:t xml:space="preserve">Foundry I</w:t>
+      </w:r>
+      <w:r>
+        <w:t xml:space="preserve"> </w:t>
+      </w:r>
+      <w:r>
+        <w:t xml:space="preserve">(Huang et al. 2025a) and</w:t>
+      </w:r>
+      <w:r>
+        <w:t xml:space="preserve"> </w:t>
+      </w:r>
+      <w:r>
+        <w:rPr>
+          <w:iCs/>
+          <w:i/>
+        </w:rPr>
+        <w:t xml:space="preserve">GIGA-Lens</w:t>
+      </w:r>
+      <w:r>
+        <w:t xml:space="preserve"> </w:t>
+      </w:r>
+      <w:r>
+        <w:t xml:space="preserve">(Gu et al. 2022) but none of which has yet flowed through to a</w:t>
+      </w:r>
+      <w:r>
+        <w:t xml:space="preserve"> </w:t>
+      </w:r>
+      <w:r>
+        <w:rPr>
+          <w:iCs/>
+          <w:i/>
+        </w:rPr>
+        <w:t xml:space="preserve">w</w:t>
+      </w:r>
+      <w:r>
+        <w:t xml:space="preserve">₀wₐ constraint paper. The DES Y6 result raises the strategic value of closing that gap.</w:t>
+      </w:r>
+    </w:p>
+    <w:p>
+      <w:pPr>
+        <w:pStyle w:val="BodyText"/>
+      </w:pPr>
+      <w:r>
+        <w:rPr>
+          <w:bCs/>
+          <w:b/>
+        </w:rPr>
+        <w:t xml:space="preserve">Why it matters for SpectrumFM.</w:t>
+      </w:r>
+      <w:r>
+        <w:t xml:space="preserve"> </w:t>
+      </w:r>
+      <w:r>
+        <w:t xml:space="preserve">The SpectrumFM proposal (v7) opens with "Massive spectroscopic surveys … are the backbone of precision cosmology, providing the data to map the universe's structure and constrain dark energy" but then never names BAO,</w:t>
+      </w:r>
+      <w:r>
+        <w:t xml:space="preserve"> </w:t>
+      </w:r>
+      <w:r>
+        <w:rPr>
+          <w:iCs/>
+          <w:i/>
+        </w:rPr>
+        <w:t xml:space="preserve">w</w:t>
+      </w:r>
+      <w:r>
+        <w:t xml:space="preserve">₀,</w:t>
+      </w:r>
+      <w:r>
+        <w:t xml:space="preserve"> </w:t>
+      </w:r>
+      <w:r>
+        <w:rPr>
+          <w:iCs/>
+          <w:i/>
+        </w:rPr>
+        <w:t xml:space="preserve">w</w:t>
+      </w:r>
+      <w:r>
+        <w:t xml:space="preserve">ₐ, CPL, or SN cosmology again. After DES Y6, the proposal sits at the operational center of the most informative late-time dark-energy stack — LRG/QSO redshifts feed DESI-DR2 BAO; SN typing feeds the Stage-IV SN Ia pipeline; lens identification (already in the proposal via the Hsu 2025 pairwise method) feeds two of the three strong-lens cosmography paths. None of these connections are made explicit in the current narrative. They should be.</w:t>
+      </w:r>
+    </w:p>
+    <w:p>
+      <w:pPr>
+        <w:pStyle w:val="BodyText"/>
+      </w:pPr>
+      <w:r>
+        <w:rPr>
+          <w:bCs/>
+          <w:b/>
+        </w:rPr>
+        <w:t xml:space="preserve">Recommended near-term actions</w:t>
+      </w:r>
+      <w:r>
+        <w:t xml:space="preserve"> </w:t>
+      </w:r>
+      <w:r>
+        <w:t xml:space="preserve">(developed in §9):</w:t>
+      </w:r>
+    </w:p>
+    <w:p>
+      <w:pPr>
+        <w:numPr>
+          <w:ilvl w:val="0"/>
+          <w:numId w:val="1007"/>
+        </w:numPr>
+        <w:pStyle w:val="Compact"/>
+      </w:pPr>
+      <w:r>
+        <w:t xml:space="preserve">Spin up a Li-et-al-2024-style static-lens</w:t>
+      </w:r>
+      <w:r>
+        <w:t xml:space="preserve"> </w:t>
+      </w:r>
+      <w:r>
+        <w:rPr>
+          <w:iCs/>
+          <w:i/>
+        </w:rPr>
+        <w:t xml:space="preserve">w</w:t>
+      </w:r>
+      <w:r>
+        <w:t xml:space="preserve">₀wₐ analysis on the existing ~3,500-candidate H20/H21/S24 catalog plus DESI σᵥ measurements — feasible</w:t>
+      </w:r>
+      <w:r>
+        <w:t xml:space="preserve"> </w:t>
+      </w:r>
+      <w:r>
+        <w:rPr>
+          <w:iCs/>
+          <w:i/>
+        </w:rPr>
+        <w:t xml:space="preserve">before</w:t>
+      </w:r>
+      <w:r>
+        <w:t xml:space="preserve"> </w:t>
+      </w:r>
+      <w:r>
+        <w:t xml:space="preserve">Rubin first light.</w:t>
+      </w:r>
+    </w:p>
+    <w:p>
+      <w:pPr>
+        <w:numPr>
+          <w:ilvl w:val="0"/>
+          <w:numId w:val="1007"/>
+        </w:numPr>
+        <w:pStyle w:val="Compact"/>
+      </w:pPr>
+      <w:r>
+        <w:t xml:space="preserve">Convert GIGA-Lens into a hierarchical Bayesian framework that yields population-level cosmological posteriors.</w:t>
+      </w:r>
+    </w:p>
+    <w:p>
+      <w:pPr>
+        <w:numPr>
+          <w:ilvl w:val="0"/>
+          <w:numId w:val="1007"/>
+        </w:numPr>
+        <w:pStyle w:val="Compact"/>
+      </w:pPr>
+      <w:r>
+        <w:t xml:space="preserve">Add a dark-energy section to the SpectrumFM v8 narrative covering BAO redshift purity, SN typing, σᵥ regression, and lens identification — with quantified expected gains.</w:t>
+      </w:r>
+    </w:p>
+    <w:p>
+      <w:pPr>
+        <w:numPr>
+          <w:ilvl w:val="0"/>
+          <w:numId w:val="1007"/>
+        </w:numPr>
+        <w:pStyle w:val="Compact"/>
+      </w:pPr>
+      <w:r>
+        <w:t xml:space="preserve">Move the Sheu 2023 lensed-SN pipeline from retrospective to live triggering, gated by a SpectrumFM SN-type classifier on host-galaxy spectra.</w:t>
+      </w:r>
+    </w:p>
+    <w:p>
+      <w:pPr>
+        <w:numPr>
+          <w:ilvl w:val="0"/>
+          <w:numId w:val="1007"/>
+        </w:numPr>
+        <w:pStyle w:val="Compact"/>
+      </w:pPr>
+      <w:r>
+        <w:t xml:space="preserve">Stand up the agentic coordination layer (§6) that turns these per-pipeline outputs into a continuously updated multi-probe cosmological constraint.</w:t>
+      </w:r>
+    </w:p>
+    <w:p>
+      <w:r>
+        <w:pict>
+          <v:rect style="width:0;height:1.5pt" o:hralign="center" o:hrstd="t" o:hr="t"/>
+        </w:pict>
+      </w:r>
+    </w:p>
+    <w:bookmarkEnd w:id="22"/>
+    <w:bookmarkStart w:id="29" w:name="X0fa768a53ed4ef65fe797a009f4fe6167b1c206"/>
+    <w:p>
+      <w:pPr>
+        <w:pStyle w:val="Heading2"/>
+      </w:pPr>
+      <w:r>
         <w:t xml:space="preserve">2. The DES Y6 Paper in Detail</w:t>
       </w:r>
     </w:p>
@@ -551,7 +1061,7 @@
         <w:t xml:space="preserve">This section is written assuming familiarity with general ML/statistics ideas but not with the specific cosmological vocabulary. Readers comfortable with the field can skip to §3.</w:t>
       </w:r>
     </w:p>
-    <w:bookmarkStart w:id="22" w:name="X51ed9f6223fba081081d3e2fa012158883ed051"/>
+    <w:bookmarkStart w:id="23" w:name="X51ed9f6223fba081081d3e2fa012158883ed051"/>
     <w:p>
       <w:pPr>
         <w:pStyle w:val="Heading3"/>
@@ -1003,8 +1513,8 @@
         <w:t xml:space="preserve">₀ = −0.82 today. Canonical single-field quintessence and k-essence models cannot make this transition smoothly (Hu 2005; Guo et al. 2005), so the result, if it holds, requires either modified gravity, dark-matter / dark-energy coupling, or an unidentified systematic.</w:t>
       </w:r>
     </w:p>
-    <w:bookmarkEnd w:id="22"/>
-    <w:bookmarkStart w:id="23" w:name="Xcc581b61d80bd7a0d88d814cc96c91febec596d"/>
+    <w:bookmarkEnd w:id="23"/>
+    <w:bookmarkStart w:id="24" w:name="Xcc581b61d80bd7a0d88d814cc96c91febec596d"/>
     <w:p>
       <w:pPr>
         <w:pStyle w:val="Heading3"/>
@@ -1025,7 +1535,7 @@
       <w:pPr>
         <w:numPr>
           <w:ilvl w:val="0"/>
-          <w:numId w:val="1002"/>
+          <w:numId w:val="1008"/>
         </w:numPr>
       </w:pPr>
       <w:r>
@@ -1094,7 +1604,7 @@
       <w:pPr>
         <w:numPr>
           <w:ilvl w:val="0"/>
-          <w:numId w:val="1002"/>
+          <w:numId w:val="1008"/>
         </w:numPr>
       </w:pPr>
       <w:r>
@@ -1240,7 +1750,7 @@
       <w:pPr>
         <w:numPr>
           <w:ilvl w:val="0"/>
-          <w:numId w:val="1002"/>
+          <w:numId w:val="1008"/>
         </w:numPr>
       </w:pPr>
       <w:r>
@@ -1277,7 +1787,7 @@
       <w:pPr>
         <w:numPr>
           <w:ilvl w:val="0"/>
-          <w:numId w:val="1002"/>
+          <w:numId w:val="1008"/>
         </w:numPr>
       </w:pPr>
       <w:r>
@@ -1323,8 +1833,8 @@
         <w:t xml:space="preserve">CMB lensing because it cross-correlates with the 3×2pt observables, which would require modeling a joint covariance the authors prefer to avoid in this Letter.</w:t>
       </w:r>
     </w:p>
-    <w:bookmarkEnd w:id="23"/>
-    <w:bookmarkStart w:id="24" w:name="Xf4e9823cd816c254174387b78f815a0826912b7"/>
+    <w:bookmarkEnd w:id="24"/>
+    <w:bookmarkStart w:id="25" w:name="Xf4e9823cd816c254174387b78f815a0826912b7"/>
     <w:p>
       <w:pPr>
         <w:pStyle w:val="Heading3"/>
@@ -1923,7 +2433,7 @@
       <w:pPr>
         <w:numPr>
           <w:ilvl w:val="0"/>
-          <w:numId w:val="1003"/>
+          <w:numId w:val="1009"/>
         </w:numPr>
         <w:pStyle w:val="Compact"/>
       </w:pPr>
@@ -1945,7 +2455,7 @@
       <w:pPr>
         <w:numPr>
           <w:ilvl w:val="0"/>
-          <w:numId w:val="1003"/>
+          <w:numId w:val="1009"/>
         </w:numPr>
         <w:pStyle w:val="Compact"/>
       </w:pPr>
@@ -2009,8 +2519,8 @@
         <w:t xml:space="preserve">ₐ &lt; 0). Excluding SN alone — the historical workhorse — still gives 2.6 σ. This is the robustness check that elevates the paper from "interesting hint" to "consistent multi-source evidence."</w:t>
       </w:r>
     </w:p>
-    <w:bookmarkEnd w:id="24"/>
-    <w:bookmarkStart w:id="25" w:name="X1ab736f7342c7625289a692ecdd7693433762e0"/>
+    <w:bookmarkEnd w:id="25"/>
+    <w:bookmarkStart w:id="26" w:name="X1ab736f7342c7625289a692ecdd7693433762e0"/>
     <w:p>
       <w:pPr>
         <w:pStyle w:val="Heading3"/>
@@ -2076,7 +2586,7 @@
       <w:pPr>
         <w:numPr>
           <w:ilvl w:val="0"/>
-          <w:numId w:val="1004"/>
+          <w:numId w:val="1010"/>
         </w:numPr>
         <w:pStyle w:val="Compact"/>
       </w:pPr>
@@ -2130,7 +2640,7 @@
       <w:pPr>
         <w:numPr>
           <w:ilvl w:val="0"/>
-          <w:numId w:val="1004"/>
+          <w:numId w:val="1010"/>
         </w:numPr>
         <w:pStyle w:val="Compact"/>
       </w:pPr>
@@ -2195,8 +2705,8 @@
         <w:t xml:space="preserve">) against DES-Y6-3×2pt growth at the same redshifts would constrain the gravity sector independently of the SN/BAO geometric channel.</w:t>
       </w:r>
     </w:p>
-    <w:bookmarkEnd w:id="25"/>
-    <w:bookmarkStart w:id="26" w:name="X66e700142e08d48bd09992bde3cdaca2f13ea32"/>
+    <w:bookmarkEnd w:id="26"/>
+    <w:bookmarkStart w:id="27" w:name="X66e700142e08d48bd09992bde3cdaca2f13ea32"/>
     <w:p>
       <w:pPr>
         <w:pStyle w:val="Heading3"/>
@@ -2217,7 +2727,7 @@
       <w:pPr>
         <w:numPr>
           <w:ilvl w:val="0"/>
-          <w:numId w:val="1005"/>
+          <w:numId w:val="1011"/>
         </w:numPr>
         <w:pStyle w:val="Compact"/>
       </w:pPr>
@@ -2239,7 +2749,7 @@
       <w:pPr>
         <w:numPr>
           <w:ilvl w:val="0"/>
-          <w:numId w:val="1005"/>
+          <w:numId w:val="1011"/>
         </w:numPr>
         <w:pStyle w:val="Compact"/>
       </w:pPr>
@@ -2261,7 +2771,7 @@
       <w:pPr>
         <w:numPr>
           <w:ilvl w:val="0"/>
-          <w:numId w:val="1005"/>
+          <w:numId w:val="1011"/>
         </w:numPr>
         <w:pStyle w:val="Compact"/>
       </w:pPr>
@@ -2343,7 +2853,7 @@
       <w:pPr>
         <w:numPr>
           <w:ilvl w:val="0"/>
-          <w:numId w:val="1005"/>
+          <w:numId w:val="1011"/>
         </w:numPr>
         <w:pStyle w:val="Compact"/>
       </w:pPr>
@@ -2365,7 +2875,7 @@
       <w:pPr>
         <w:numPr>
           <w:ilvl w:val="0"/>
-          <w:numId w:val="1005"/>
+          <w:numId w:val="1011"/>
         </w:numPr>
         <w:pStyle w:val="Compact"/>
       </w:pPr>
@@ -2413,7 +2923,7 @@
       <w:pPr>
         <w:numPr>
           <w:ilvl w:val="0"/>
-          <w:numId w:val="1005"/>
+          <w:numId w:val="1011"/>
         </w:numPr>
         <w:pStyle w:val="Compact"/>
       </w:pPr>
@@ -2431,8 +2941,8 @@
         <w:t xml:space="preserve">DES-Dovekie, Pantheon+, and Union3.1 (after recent reanalyses) all give comparable significances (3.2 σ, 3.4 σ when combined with DESI DR2 BAO + CMB).</w:t>
       </w:r>
     </w:p>
-    <w:bookmarkEnd w:id="26"/>
-    <w:bookmarkStart w:id="27" w:name="Xea0987aff34b7a58b5dc2da9c26d5dd5fcb687d"/>
+    <w:bookmarkEnd w:id="27"/>
+    <w:bookmarkStart w:id="28" w:name="Xea0987aff34b7a58b5dc2da9c26d5dd5fcb687d"/>
     <w:p>
       <w:pPr>
         <w:pStyle w:val="Heading3"/>
@@ -2598,9 +3108,9 @@
         </w:pict>
       </w:r>
     </w:p>
-    <w:bookmarkEnd w:id="27"/>
     <w:bookmarkEnd w:id="28"/>
-    <w:bookmarkStart w:id="32" w:name="Xebde256e9027d29b1c0425ec6675ee97ddd6a0a"/>
+    <w:bookmarkEnd w:id="29"/>
+    <w:bookmarkStart w:id="33" w:name="Xebde256e9027d29b1c0425ec6675ee97ddd6a0a"/>
     <w:p>
       <w:pPr>
         <w:pStyle w:val="Heading2"/>
@@ -2609,7 +3119,7 @@
         <w:t xml:space="preserve">3. Huang's Strong-Lensing Program</w:t>
       </w:r>
     </w:p>
-    <w:bookmarkStart w:id="29" w:name="X70c6673cca24741713ea1a89101f0eb081c853c"/>
+    <w:bookmarkStart w:id="30" w:name="X70c6673cca24741713ea1a89101f0eb081c853c"/>
     <w:p>
       <w:pPr>
         <w:pStyle w:val="Heading3"/>
@@ -2642,7 +3152,7 @@
       <w:pPr>
         <w:numPr>
           <w:ilvl w:val="0"/>
-          <w:numId w:val="1006"/>
+          <w:numId w:val="1012"/>
         </w:numPr>
         <w:pStyle w:val="Compact"/>
       </w:pPr>
@@ -2664,7 +3174,7 @@
       <w:pPr>
         <w:numPr>
           <w:ilvl w:val="0"/>
-          <w:numId w:val="1006"/>
+          <w:numId w:val="1012"/>
         </w:numPr>
         <w:pStyle w:val="Compact"/>
       </w:pPr>
@@ -2686,7 +3196,7 @@
       <w:pPr>
         <w:numPr>
           <w:ilvl w:val="0"/>
-          <w:numId w:val="1006"/>
+          <w:numId w:val="1012"/>
         </w:numPr>
         <w:pStyle w:val="Compact"/>
       </w:pPr>
@@ -2708,7 +3218,7 @@
       <w:pPr>
         <w:numPr>
           <w:ilvl w:val="0"/>
-          <w:numId w:val="1006"/>
+          <w:numId w:val="1012"/>
         </w:numPr>
         <w:pStyle w:val="Compact"/>
       </w:pPr>
@@ -2730,7 +3240,7 @@
       <w:pPr>
         <w:numPr>
           <w:ilvl w:val="0"/>
-          <w:numId w:val="1006"/>
+          <w:numId w:val="1012"/>
         </w:numPr>
         <w:pStyle w:val="Compact"/>
       </w:pPr>
@@ -2752,7 +3262,7 @@
       <w:pPr>
         <w:numPr>
           <w:ilvl w:val="0"/>
-          <w:numId w:val="1006"/>
+          <w:numId w:val="1012"/>
         </w:numPr>
         <w:pStyle w:val="Compact"/>
       </w:pPr>
@@ -2774,7 +3284,7 @@
       <w:pPr>
         <w:numPr>
           <w:ilvl w:val="0"/>
-          <w:numId w:val="1006"/>
+          <w:numId w:val="1012"/>
         </w:numPr>
         <w:pStyle w:val="Compact"/>
       </w:pPr>
@@ -2796,7 +3306,7 @@
       <w:pPr>
         <w:numPr>
           <w:ilvl w:val="0"/>
-          <w:numId w:val="1006"/>
+          <w:numId w:val="1012"/>
         </w:numPr>
         <w:pStyle w:val="Compact"/>
       </w:pPr>
@@ -2814,8 +3324,8 @@
         <w:t xml:space="preserve">Same image-subtraction substrate plus PSF photometry, σ-magnitude variability threshold; 20 candidates returned.</w:t>
       </w:r>
     </w:p>
-    <w:bookmarkEnd w:id="29"/>
-    <w:bookmarkStart w:id="30" w:name="Xab570876923bf7eef5619d3d9479fae32379df1"/>
+    <w:bookmarkEnd w:id="30"/>
+    <w:bookmarkStart w:id="31" w:name="Xab570876923bf7eef5619d3d9479fae32379df1"/>
     <w:p>
       <w:pPr>
         <w:pStyle w:val="Heading3"/>
@@ -3452,8 +3962,8 @@
         <w:t xml:space="preserve">values. The pipeline ingredients exist.</w:t>
       </w:r>
     </w:p>
-    <w:bookmarkEnd w:id="30"/>
-    <w:bookmarkStart w:id="31" w:name="X198a4ad912a23f3e1b418664d58e07a5325520e"/>
+    <w:bookmarkEnd w:id="31"/>
+    <w:bookmarkStart w:id="32" w:name="X198a4ad912a23f3e1b418664d58e07a5325520e"/>
     <w:p>
       <w:pPr>
         <w:pStyle w:val="Heading3"/>
@@ -3506,9 +4016,9 @@
         </w:pict>
       </w:r>
     </w:p>
-    <w:bookmarkEnd w:id="31"/>
     <w:bookmarkEnd w:id="32"/>
-    <w:bookmarkStart w:id="36" w:name="Xcbc2c46850cf541de8056ba2026fc3a862993fa"/>
+    <w:bookmarkEnd w:id="33"/>
+    <w:bookmarkStart w:id="37" w:name="Xcbc2c46850cf541de8056ba2026fc3a862993fa"/>
     <w:p>
       <w:pPr>
         <w:pStyle w:val="Heading2"/>
@@ -3517,7 +4027,7 @@
         <w:t xml:space="preserve">4. Implications for Huang's Work</w:t>
       </w:r>
     </w:p>
-    <w:bookmarkStart w:id="33" w:name="X5562bd9ac4d6b7c9de413245fab8e96ab63f39f"/>
+    <w:bookmarkStart w:id="34" w:name="X5562bd9ac4d6b7c9de413245fab8e96ab63f39f"/>
     <w:p>
       <w:pPr>
         <w:pStyle w:val="Heading3"/>
@@ -3538,7 +4048,7 @@
       <w:pPr>
         <w:numPr>
           <w:ilvl w:val="0"/>
-          <w:numId w:val="1007"/>
+          <w:numId w:val="1013"/>
         </w:numPr>
         <w:pStyle w:val="Compact"/>
       </w:pPr>
@@ -3560,7 +4070,7 @@
       <w:pPr>
         <w:numPr>
           <w:ilvl w:val="0"/>
-          <w:numId w:val="1007"/>
+          <w:numId w:val="1013"/>
         </w:numPr>
         <w:pStyle w:val="Compact"/>
       </w:pPr>
@@ -3598,7 +4108,7 @@
       <w:pPr>
         <w:numPr>
           <w:ilvl w:val="0"/>
-          <w:numId w:val="1007"/>
+          <w:numId w:val="1013"/>
         </w:numPr>
         <w:pStyle w:val="Compact"/>
       </w:pPr>
@@ -3642,8 +4152,8 @@
         <w:t xml:space="preserve">ₐ posteriors with and without each lensing probe class included — is a deliverable in its own right.</w:t>
       </w:r>
     </w:p>
-    <w:bookmarkEnd w:id="33"/>
-    <w:bookmarkStart w:id="34" w:name="X84586f264e56c05d03cf99a870206894949c446"/>
+    <w:bookmarkEnd w:id="34"/>
+    <w:bookmarkStart w:id="35" w:name="X84586f264e56c05d03cf99a870206894949c446"/>
     <w:p>
       <w:pPr>
         <w:pStyle w:val="Heading3"/>
@@ -3664,7 +4174,7 @@
       <w:pPr>
         <w:numPr>
           <w:ilvl w:val="0"/>
-          <w:numId w:val="1008"/>
+          <w:numId w:val="1014"/>
         </w:numPr>
       </w:pPr>
       <w:r>
@@ -3847,7 +4357,7 @@
       <w:pPr>
         <w:numPr>
           <w:ilvl w:val="0"/>
-          <w:numId w:val="1008"/>
+          <w:numId w:val="1014"/>
         </w:numPr>
       </w:pPr>
       <w:r>
@@ -3891,7 +4401,7 @@
       <w:pPr>
         <w:numPr>
           <w:ilvl w:val="0"/>
-          <w:numId w:val="1008"/>
+          <w:numId w:val="1014"/>
         </w:numPr>
       </w:pPr>
       <w:r>
@@ -3928,7 +4438,7 @@
       <w:pPr>
         <w:numPr>
           <w:ilvl w:val="0"/>
-          <w:numId w:val="1008"/>
+          <w:numId w:val="1014"/>
         </w:numPr>
       </w:pPr>
       <w:r>
@@ -3965,7 +4475,7 @@
       <w:pPr>
         <w:numPr>
           <w:ilvl w:val="0"/>
-          <w:numId w:val="1008"/>
+          <w:numId w:val="1014"/>
         </w:numPr>
       </w:pPr>
       <w:r>
@@ -3982,8 +4492,8 @@
         <w:t xml:space="preserve">Sheu 2024b (carousel), Dux 2024, and Bolamperti 2024 each give one or a few systems. Per Foundry I §1, even a small sample of compound lenses is a powerful cosmological probe (Collett &amp; Auger 2014; Linder 2016; Sharma &amp; Linder 2022; Sharma, Collett &amp; Linder 2023). Reframing this from "interesting curiosity" to "lead cosmology deliverable" repositions the program.</w:t>
       </w:r>
     </w:p>
-    <w:bookmarkEnd w:id="34"/>
-    <w:bookmarkStart w:id="35" w:name="X4bd22b703365ab2305e3ca8187fcdd135cd8ae8"/>
+    <w:bookmarkEnd w:id="35"/>
+    <w:bookmarkStart w:id="36" w:name="X4bd22b703365ab2305e3ca8187fcdd135cd8ae8"/>
     <w:p>
       <w:pPr>
         <w:pStyle w:val="Heading3"/>
@@ -4004,7 +4514,7 @@
       <w:pPr>
         <w:numPr>
           <w:ilvl w:val="0"/>
-          <w:numId w:val="1009"/>
+          <w:numId w:val="1015"/>
         </w:numPr>
         <w:pStyle w:val="Compact"/>
       </w:pPr>
@@ -4069,7 +4579,7 @@
       <w:pPr>
         <w:numPr>
           <w:ilvl w:val="0"/>
-          <w:numId w:val="1009"/>
+          <w:numId w:val="1015"/>
         </w:numPr>
         <w:pStyle w:val="Compact"/>
       </w:pPr>
@@ -4091,7 +4601,7 @@
       <w:pPr>
         <w:numPr>
           <w:ilvl w:val="0"/>
-          <w:numId w:val="1009"/>
+          <w:numId w:val="1015"/>
         </w:numPr>
         <w:pStyle w:val="Compact"/>
       </w:pPr>
@@ -4113,7 +4623,7 @@
       <w:pPr>
         <w:numPr>
           <w:ilvl w:val="0"/>
-          <w:numId w:val="1009"/>
+          <w:numId w:val="1015"/>
         </w:numPr>
         <w:pStyle w:val="Compact"/>
       </w:pPr>
@@ -4138,9 +4648,9 @@
         </w:pict>
       </w:r>
     </w:p>
-    <w:bookmarkEnd w:id="35"/>
     <w:bookmarkEnd w:id="36"/>
-    <w:bookmarkStart w:id="41" w:name="X718780227a7edfbd754fb9eb98786bede1c36dc"/>
+    <w:bookmarkEnd w:id="37"/>
+    <w:bookmarkStart w:id="42" w:name="X718780227a7edfbd754fb9eb98786bede1c36dc"/>
     <w:p>
       <w:pPr>
         <w:pStyle w:val="Heading2"/>
@@ -4149,7 +4659,7 @@
         <w:t xml:space="preserve">5. Implications for the SpectrumFM Proposal</w:t>
       </w:r>
     </w:p>
-    <w:bookmarkStart w:id="37" w:name="X1ead1f00ec000540f2b1041645dd26b3356e2a1"/>
+    <w:bookmarkStart w:id="38" w:name="X1ead1f00ec000540f2b1041645dd26b3356e2a1"/>
     <w:p>
       <w:pPr>
         <w:pStyle w:val="Heading3"/>
@@ -4210,8 +4720,8 @@
         <w:t xml:space="preserve">After DES Y6, the structural argument tightens to a quantitative one: SpectrumFM's primary downstream tasks each map to a probe in the DES Y6 stack. The proposal should say so explicitly. This is the single highest-leverage edit to v8 / Phase II.</w:t>
       </w:r>
     </w:p>
-    <w:bookmarkEnd w:id="37"/>
-    <w:bookmarkStart w:id="38" w:name="X6a559646460ed4b73b67adf93e4482944d184b6"/>
+    <w:bookmarkEnd w:id="38"/>
+    <w:bookmarkStart w:id="39" w:name="X6a559646460ed4b73b67adf93e4482944d184b6"/>
     <w:p>
       <w:pPr>
         <w:pStyle w:val="Heading3"/>
@@ -4689,8 +5199,8 @@
         <w:t xml:space="preserve">₀wₐ measurement.</w:t>
       </w:r>
     </w:p>
-    <w:bookmarkEnd w:id="38"/>
-    <w:bookmarkStart w:id="39" w:name="X9b1af6349a7d00c583c4bac906de9bf4a90c7e2"/>
+    <w:bookmarkEnd w:id="39"/>
+    <w:bookmarkStart w:id="40" w:name="X9b1af6349a7d00c583c4bac906de9bf4a90c7e2"/>
     <w:p>
       <w:pPr>
         <w:pStyle w:val="Heading3"/>
@@ -4739,8 +5249,8 @@
         <w:t xml:space="preserve">The natural rhetorical bridge: SpectrumFM is the spectroscopic-side foundation model for the same multi-survey dark-energy program the DES Y6 paper just closed Stage III on. Saying so explicitly is the simplest way to land the cosmological framing.</w:t>
       </w:r>
     </w:p>
-    <w:bookmarkEnd w:id="39"/>
-    <w:bookmarkStart w:id="40" w:name="X4581e460489a31d5bfb5da1febaa0e89653d12e"/>
+    <w:bookmarkEnd w:id="40"/>
+    <w:bookmarkStart w:id="41" w:name="X4581e460489a31d5bfb5da1febaa0e89653d12e"/>
     <w:p>
       <w:pPr>
         <w:pStyle w:val="Heading3"/>
@@ -4784,9 +5294,9 @@
         </w:pict>
       </w:r>
     </w:p>
-    <w:bookmarkEnd w:id="40"/>
     <w:bookmarkEnd w:id="41"/>
-    <w:bookmarkStart w:id="51" w:name="X9baecef7a3b1d08b519baa3e654edd8bba85ff4"/>
+    <w:bookmarkEnd w:id="42"/>
+    <w:bookmarkStart w:id="52" w:name="X9baecef7a3b1d08b519baa3e654edd8bba85ff4"/>
     <w:p>
       <w:pPr>
         <w:pStyle w:val="Heading2"/>
@@ -4813,7 +5323,7 @@
         <w:t xml:space="preserve">) and with the agentic-coding expertise he brings to the Foundry program. Per the v7 proposal it is also the role for which v7 itself provides the least architectural detail. The DES Y6 result motivates a specific architecture.</w:t>
       </w:r>
     </w:p>
-    <w:bookmarkStart w:id="42" w:name="Xc48e3fbcf4d8f1c0532e9841cfb50991a34e0b6"/>
+    <w:bookmarkStart w:id="43" w:name="Xc48e3fbcf4d8f1c0532e9841cfb50991a34e0b6"/>
     <w:p>
       <w:pPr>
         <w:pStyle w:val="Heading3"/>
@@ -4879,7 +5389,7 @@
       <w:pPr>
         <w:numPr>
           <w:ilvl w:val="0"/>
-          <w:numId w:val="1010"/>
+          <w:numId w:val="1016"/>
         </w:numPr>
         <w:pStyle w:val="Compact"/>
       </w:pPr>
@@ -4891,7 +5401,7 @@
       <w:pPr>
         <w:numPr>
           <w:ilvl w:val="0"/>
-          <w:numId w:val="1010"/>
+          <w:numId w:val="1016"/>
         </w:numPr>
         <w:pStyle w:val="Compact"/>
       </w:pPr>
@@ -4903,7 +5413,7 @@
       <w:pPr>
         <w:numPr>
           <w:ilvl w:val="0"/>
-          <w:numId w:val="1010"/>
+          <w:numId w:val="1016"/>
         </w:numPr>
         <w:pStyle w:val="Compact"/>
       </w:pPr>
@@ -4915,7 +5425,7 @@
       <w:pPr>
         <w:numPr>
           <w:ilvl w:val="0"/>
-          <w:numId w:val="1010"/>
+          <w:numId w:val="1016"/>
         </w:numPr>
         <w:pStyle w:val="Compact"/>
       </w:pPr>
@@ -4927,7 +5437,7 @@
       <w:pPr>
         <w:numPr>
           <w:ilvl w:val="0"/>
-          <w:numId w:val="1010"/>
+          <w:numId w:val="1016"/>
         </w:numPr>
         <w:pStyle w:val="Compact"/>
       </w:pPr>
@@ -4943,8 +5453,8 @@
         <w:t xml:space="preserve">Each of these is a natural agent. Their concrete designs follow.</w:t>
       </w:r>
     </w:p>
-    <w:bookmarkEnd w:id="42"/>
-    <w:bookmarkStart w:id="48" w:name="Xd4210e200fc823263bb5766a8ab84715f41ff2d"/>
+    <w:bookmarkEnd w:id="43"/>
+    <w:bookmarkStart w:id="49" w:name="Xd4210e200fc823263bb5766a8ab84715f41ff2d"/>
     <w:p>
       <w:pPr>
         <w:pStyle w:val="Heading3"/>
@@ -4961,7 +5471,7 @@
         <w:t xml:space="preserve">In each case, the agent is given a name, a clearly bounded role, a tool surface (the functions the agent calls), and a memory store (what state survives between invocations). Tool surfaces use illustrative dot-notation; the corresponding tools can be either Python functions exposed via the SpectrumFM tooling layer or MCP-style tool servers wrapping existing pipelines.</w:t>
       </w:r>
     </w:p>
-    <w:bookmarkStart w:id="43" w:name="i-lens-triage-agent"/>
+    <w:bookmarkStart w:id="44" w:name="i-lens-triage-agent"/>
     <w:p>
       <w:pPr>
         <w:pStyle w:val="Heading4"/>
@@ -5110,8 +5620,8 @@
         <w:t xml:space="preserve">Heuristics from H21 morphology + cutout color + presence of nearby spectroscopic pair → dispatch table.</w:t>
       </w:r>
     </w:p>
-    <w:bookmarkEnd w:id="43"/>
-    <w:bookmarkStart w:id="44" w:name="ii-cosmology-audit-agent"/>
+    <w:bookmarkEnd w:id="44"/>
+    <w:bookmarkStart w:id="45" w:name="ii-cosmology-audit-agent"/>
     <w:p>
       <w:pPr>
         <w:pStyle w:val="Heading4"/>
@@ -5295,8 +5805,8 @@
         <w:t xml:space="preserve">Chain artifacts (HDF5); constraint-shift log; rolling leave-one-out table.</w:t>
       </w:r>
     </w:p>
-    <w:bookmarkEnd w:id="44"/>
-    <w:bookmarkStart w:id="45" w:name="iii-live-transient-follow-up-agent"/>
+    <w:bookmarkEnd w:id="45"/>
+    <w:bookmarkStart w:id="46" w:name="iii-live-transient-follow-up-agent"/>
     <w:p>
       <w:pPr>
         <w:pStyle w:val="Heading4"/>
@@ -5409,8 +5919,8 @@
         <w:t xml:space="preserve">Detection-state DB; ToO ledger.</w:t>
       </w:r>
     </w:p>
-    <w:bookmarkEnd w:id="45"/>
-    <w:bookmarkStart w:id="46" w:name="iv-vi-pre-grading-agent"/>
+    <w:bookmarkEnd w:id="46"/>
+    <w:bookmarkStart w:id="47" w:name="iv-vi-pre-grading-agent"/>
     <w:p>
       <w:pPr>
         <w:pStyle w:val="Heading4"/>
@@ -5523,8 +6033,8 @@
         <w:t xml:space="preserve">VI corpus embeddings (a small vector DB); grade-decision history.</w:t>
       </w:r>
     </w:p>
-    <w:bookmarkEnd w:id="46"/>
-    <w:bookmarkStart w:id="47" w:name="v-desi-ii--spec-s5-forecasting-agent"/>
+    <w:bookmarkEnd w:id="47"/>
+    <w:bookmarkStart w:id="48" w:name="v-desi-ii--spec-s5-forecasting-agent"/>
     <w:p>
       <w:pPr>
         <w:pStyle w:val="Heading4"/>
@@ -5651,9 +6161,9 @@
         <w:t xml:space="preserve">Cached survey simulations; forecast-result registry.</w:t>
       </w:r>
     </w:p>
-    <w:bookmarkEnd w:id="47"/>
     <w:bookmarkEnd w:id="48"/>
-    <w:bookmarkStart w:id="49" w:name="Xfd117337217ef7b35264d000dd37b7b28740352"/>
+    <w:bookmarkEnd w:id="49"/>
+    <w:bookmarkStart w:id="50" w:name="Xfd117337217ef7b35264d000dd37b7b28740352"/>
     <w:p>
       <w:pPr>
         <w:pStyle w:val="Heading3"/>
@@ -5674,7 +6184,7 @@
       <w:pPr>
         <w:numPr>
           <w:ilvl w:val="0"/>
-          <w:numId w:val="1011"/>
+          <w:numId w:val="1017"/>
         </w:numPr>
         <w:pStyle w:val="Compact"/>
       </w:pPr>
@@ -5702,7 +6212,7 @@
       <w:pPr>
         <w:numPr>
           <w:ilvl w:val="0"/>
-          <w:numId w:val="1011"/>
+          <w:numId w:val="1017"/>
         </w:numPr>
         <w:pStyle w:val="Compact"/>
       </w:pPr>
@@ -5727,7 +6237,7 @@
       <w:pPr>
         <w:numPr>
           <w:ilvl w:val="0"/>
-          <w:numId w:val="1011"/>
+          <w:numId w:val="1017"/>
         </w:numPr>
         <w:pStyle w:val="Compact"/>
       </w:pPr>
@@ -5745,8 +6255,8 @@
         <w:t xml:space="preserve">re-used between GIGA-Lens per-system inference and the Cosmology Audit Agent's population-level posterior — i.e. the same forward model serves both per-lens fits and the joint cosmological constraint.</w:t>
       </w:r>
     </w:p>
-    <w:bookmarkEnd w:id="49"/>
-    <w:bookmarkStart w:id="50" w:name="X1603b25eafd088f55e1f16d5537e2389986afc8"/>
+    <w:bookmarkEnd w:id="50"/>
+    <w:bookmarkStart w:id="51" w:name="X1603b25eafd088f55e1f16d5537e2389986afc8"/>
     <w:p>
       <w:pPr>
         <w:pStyle w:val="Heading3"/>
@@ -5770,9 +6280,9 @@
         </w:pict>
       </w:r>
     </w:p>
-    <w:bookmarkEnd w:id="50"/>
     <w:bookmarkEnd w:id="51"/>
-    <w:bookmarkStart w:id="52" w:name="X835d2a0d6e8a1d531fc80c4f98a0fa58d2d2650"/>
+    <w:bookmarkEnd w:id="52"/>
+    <w:bookmarkStart w:id="53" w:name="X835d2a0d6e8a1d531fc80c4f98a0fa58d2d2650"/>
     <w:p>
       <w:pPr>
         <w:pStyle w:val="Heading2"/>
@@ -5793,7 +6303,7 @@
       <w:pPr>
         <w:numPr>
           <w:ilvl w:val="0"/>
-          <w:numId w:val="1012"/>
+          <w:numId w:val="1018"/>
         </w:numPr>
         <w:pStyle w:val="Compact"/>
       </w:pPr>
@@ -5825,7 +6335,7 @@
       <w:pPr>
         <w:numPr>
           <w:ilvl w:val="0"/>
-          <w:numId w:val="1012"/>
+          <w:numId w:val="1018"/>
         </w:numPr>
         <w:pStyle w:val="Compact"/>
       </w:pPr>
@@ -5847,7 +6357,7 @@
       <w:pPr>
         <w:numPr>
           <w:ilvl w:val="0"/>
-          <w:numId w:val="1012"/>
+          <w:numId w:val="1018"/>
         </w:numPr>
         <w:pStyle w:val="Compact"/>
       </w:pPr>
@@ -5869,7 +6379,7 @@
       <w:pPr>
         <w:numPr>
           <w:ilvl w:val="0"/>
-          <w:numId w:val="1012"/>
+          <w:numId w:val="1018"/>
         </w:numPr>
         <w:pStyle w:val="Compact"/>
       </w:pPr>
@@ -5891,7 +6401,7 @@
       <w:pPr>
         <w:numPr>
           <w:ilvl w:val="0"/>
-          <w:numId w:val="1012"/>
+          <w:numId w:val="1018"/>
         </w:numPr>
         <w:pStyle w:val="Compact"/>
       </w:pPr>
@@ -5913,7 +6423,7 @@
       <w:pPr>
         <w:numPr>
           <w:ilvl w:val="0"/>
-          <w:numId w:val="1012"/>
+          <w:numId w:val="1018"/>
         </w:numPr>
         <w:pStyle w:val="Compact"/>
       </w:pPr>
@@ -5935,7 +6445,7 @@
       <w:pPr>
         <w:numPr>
           <w:ilvl w:val="0"/>
-          <w:numId w:val="1012"/>
+          <w:numId w:val="1018"/>
         </w:numPr>
         <w:pStyle w:val="Compact"/>
       </w:pPr>
@@ -5960,8 +6470,8 @@
         </w:pict>
       </w:r>
     </w:p>
-    <w:bookmarkEnd w:id="52"/>
-    <w:bookmarkStart w:id="53" w:name="X2841c217c4374be2649c2ed69808eac810642ff"/>
+    <w:bookmarkEnd w:id="53"/>
+    <w:bookmarkStart w:id="54" w:name="X2841c217c4374be2649c2ed69808eac810642ff"/>
     <w:p>
       <w:pPr>
         <w:pStyle w:val="Heading2"/>
@@ -5974,7 +6484,7 @@
       <w:pPr>
         <w:numPr>
           <w:ilvl w:val="0"/>
-          <w:numId w:val="1013"/>
+          <w:numId w:val="1019"/>
         </w:numPr>
         <w:pStyle w:val="Compact"/>
       </w:pPr>
@@ -5996,7 +6506,7 @@
       <w:pPr>
         <w:numPr>
           <w:ilvl w:val="0"/>
-          <w:numId w:val="1013"/>
+          <w:numId w:val="1019"/>
         </w:numPr>
         <w:pStyle w:val="Compact"/>
       </w:pPr>
@@ -6018,7 +6528,7 @@
       <w:pPr>
         <w:numPr>
           <w:ilvl w:val="0"/>
-          <w:numId w:val="1013"/>
+          <w:numId w:val="1019"/>
         </w:numPr>
         <w:pStyle w:val="Compact"/>
       </w:pPr>
@@ -6086,7 +6596,7 @@
       <w:pPr>
         <w:numPr>
           <w:ilvl w:val="0"/>
-          <w:numId w:val="1013"/>
+          <w:numId w:val="1019"/>
         </w:numPr>
         <w:pStyle w:val="Compact"/>
       </w:pPr>
@@ -6108,7 +6618,7 @@
       <w:pPr>
         <w:numPr>
           <w:ilvl w:val="0"/>
-          <w:numId w:val="1013"/>
+          <w:numId w:val="1019"/>
         </w:numPr>
         <w:pStyle w:val="Compact"/>
       </w:pPr>
@@ -6130,7 +6640,7 @@
       <w:pPr>
         <w:numPr>
           <w:ilvl w:val="0"/>
-          <w:numId w:val="1013"/>
+          <w:numId w:val="1019"/>
         </w:numPr>
         <w:pStyle w:val="Compact"/>
       </w:pPr>
@@ -6155,8 +6665,8 @@
         </w:pict>
       </w:r>
     </w:p>
-    <w:bookmarkEnd w:id="53"/>
-    <w:bookmarkStart w:id="54" w:name="X02b8d75d000e8790a385e3b0534f9ea3b804d5d"/>
+    <w:bookmarkEnd w:id="54"/>
+    <w:bookmarkStart w:id="55" w:name="X02b8d75d000e8790a385e3b0534f9ea3b804d5d"/>
     <w:p>
       <w:pPr>
         <w:pStyle w:val="Heading2"/>
@@ -6177,7 +6687,7 @@
       <w:pPr>
         <w:numPr>
           <w:ilvl w:val="0"/>
-          <w:numId w:val="1014"/>
+          <w:numId w:val="1020"/>
         </w:numPr>
         <w:pStyle w:val="Compact"/>
       </w:pPr>
@@ -6238,7 +6748,7 @@
       <w:pPr>
         <w:numPr>
           <w:ilvl w:val="0"/>
-          <w:numId w:val="1014"/>
+          <w:numId w:val="1020"/>
         </w:numPr>
         <w:pStyle w:val="Compact"/>
       </w:pPr>
@@ -6296,7 +6806,7 @@
       <w:pPr>
         <w:numPr>
           <w:ilvl w:val="0"/>
-          <w:numId w:val="1014"/>
+          <w:numId w:val="1020"/>
         </w:numPr>
         <w:pStyle w:val="Compact"/>
       </w:pPr>
@@ -6341,7 +6851,7 @@
       <w:pPr>
         <w:numPr>
           <w:ilvl w:val="0"/>
-          <w:numId w:val="1014"/>
+          <w:numId w:val="1020"/>
         </w:numPr>
         <w:pStyle w:val="Compact"/>
       </w:pPr>
@@ -6363,7 +6873,7 @@
       <w:pPr>
         <w:numPr>
           <w:ilvl w:val="0"/>
-          <w:numId w:val="1014"/>
+          <w:numId w:val="1020"/>
         </w:numPr>
         <w:pStyle w:val="Compact"/>
       </w:pPr>
@@ -6385,7 +6895,7 @@
       <w:pPr>
         <w:numPr>
           <w:ilvl w:val="0"/>
-          <w:numId w:val="1014"/>
+          <w:numId w:val="1020"/>
         </w:numPr>
         <w:pStyle w:val="Compact"/>
       </w:pPr>
@@ -6407,7 +6917,7 @@
       <w:pPr>
         <w:numPr>
           <w:ilvl w:val="0"/>
-          <w:numId w:val="1014"/>
+          <w:numId w:val="1020"/>
         </w:numPr>
         <w:pStyle w:val="Compact"/>
       </w:pPr>
@@ -6444,8 +6954,8 @@
         <w:t xml:space="preserve">Greg Benson, USF — working memo prepared for the Huang strong-lensing group and the SpectrumFM team, 2026-05-26.</w:t>
       </w:r>
     </w:p>
-    <w:bookmarkEnd w:id="54"/>
     <w:bookmarkEnd w:id="55"/>
+    <w:bookmarkEnd w:id="56"/>
     <w:sectPr/>
   </w:body>
 </w:document>
@@ -6552,6 +7062,82 @@
       </w:pPr>
     </w:lvl>
   </w:abstractNum>
+  <w:abstractNum w:abstractNumId="991">
+    <w:nsid w:val="A991"/>
+    <w:multiLevelType w:val="multilevel"/>
+    <w:lvl w:ilvl="0">
+      <w:numFmt w:val="bullet"/>
+      <w:lvlText w:val="•"/>
+      <w:lvlJc w:val="left"/>
+      <w:pPr>
+        <w:ind w:left="720" w:hanging="480"/>
+      </w:pPr>
+    </w:lvl>
+    <w:lvl w:ilvl="1">
+      <w:numFmt w:val="bullet"/>
+      <w:lvlText w:val="–"/>
+      <w:lvlJc w:val="left"/>
+      <w:pPr>
+        <w:ind w:left="1440" w:hanging="480"/>
+      </w:pPr>
+    </w:lvl>
+    <w:lvl w:ilvl="2">
+      <w:numFmt w:val="bullet"/>
+      <w:lvlText w:val="•"/>
+      <w:lvlJc w:val="left"/>
+      <w:pPr>
+        <w:ind w:left="2160" w:hanging="480"/>
+      </w:pPr>
+    </w:lvl>
+    <w:lvl w:ilvl="3">
+      <w:numFmt w:val="bullet"/>
+      <w:lvlText w:val="–"/>
+      <w:lvlJc w:val="left"/>
+      <w:pPr>
+        <w:ind w:left="2880" w:hanging="480"/>
+      </w:pPr>
+    </w:lvl>
+    <w:lvl w:ilvl="4">
+      <w:numFmt w:val="bullet"/>
+      <w:lvlText w:val="•"/>
+      <w:lvlJc w:val="left"/>
+      <w:pPr>
+        <w:ind w:left="3600" w:hanging="480"/>
+      </w:pPr>
+    </w:lvl>
+    <w:lvl w:ilvl="5">
+      <w:numFmt w:val="bullet"/>
+      <w:lvlText w:val="–"/>
+      <w:lvlJc w:val="left"/>
+      <w:pPr>
+        <w:ind w:left="4320" w:hanging="480"/>
+      </w:pPr>
+    </w:lvl>
+    <w:lvl w:ilvl="6">
+      <w:numFmt w:val="bullet"/>
+      <w:lvlText w:val="•"/>
+      <w:lvlJc w:val="left"/>
+      <w:pPr>
+        <w:ind w:left="5040" w:hanging="480"/>
+      </w:pPr>
+    </w:lvl>
+    <w:lvl w:ilvl="7">
+      <w:numFmt w:val="bullet"/>
+      <w:lvlText w:val="–"/>
+      <w:lvlJc w:val="left"/>
+      <w:pPr>
+        <w:ind w:left="5760" w:hanging="480"/>
+      </w:pPr>
+    </w:lvl>
+    <w:lvl w:ilvl="8">
+      <w:numFmt w:val="bullet"/>
+      <w:lvlText w:val="•"/>
+      <w:lvlJc w:val="left"/>
+      <w:pPr>
+        <w:ind w:left="6480" w:hanging="480"/>
+      </w:pPr>
+    </w:lvl>
+  </w:abstractNum>
   <w:abstractNum w:abstractNumId="99411">
     <w:nsid w:val="A99411"/>
     <w:multiLevelType w:val="multilevel"/>
@@ -6637,147 +7223,17 @@
       </w:pPr>
     </w:lvl>
   </w:abstractNum>
-  <w:abstractNum w:abstractNumId="991">
-    <w:nsid w:val="A991"/>
-    <w:multiLevelType w:val="multilevel"/>
-    <w:lvl w:ilvl="0">
-      <w:numFmt w:val="bullet"/>
-      <w:lvlText w:val="•"/>
-      <w:lvlJc w:val="left"/>
-      <w:pPr>
-        <w:ind w:left="720" w:hanging="480"/>
-      </w:pPr>
-    </w:lvl>
-    <w:lvl w:ilvl="1">
-      <w:numFmt w:val="bullet"/>
-      <w:lvlText w:val="–"/>
-      <w:lvlJc w:val="left"/>
-      <w:pPr>
-        <w:ind w:left="1440" w:hanging="480"/>
-      </w:pPr>
-    </w:lvl>
-    <w:lvl w:ilvl="2">
-      <w:numFmt w:val="bullet"/>
-      <w:lvlText w:val="•"/>
-      <w:lvlJc w:val="left"/>
-      <w:pPr>
-        <w:ind w:left="2160" w:hanging="480"/>
-      </w:pPr>
-    </w:lvl>
-    <w:lvl w:ilvl="3">
-      <w:numFmt w:val="bullet"/>
-      <w:lvlText w:val="–"/>
-      <w:lvlJc w:val="left"/>
-      <w:pPr>
-        <w:ind w:left="2880" w:hanging="480"/>
-      </w:pPr>
-    </w:lvl>
-    <w:lvl w:ilvl="4">
-      <w:numFmt w:val="bullet"/>
-      <w:lvlText w:val="•"/>
-      <w:lvlJc w:val="left"/>
-      <w:pPr>
-        <w:ind w:left="3600" w:hanging="480"/>
-      </w:pPr>
-    </w:lvl>
-    <w:lvl w:ilvl="5">
-      <w:numFmt w:val="bullet"/>
-      <w:lvlText w:val="–"/>
-      <w:lvlJc w:val="left"/>
-      <w:pPr>
-        <w:ind w:left="4320" w:hanging="480"/>
-      </w:pPr>
-    </w:lvl>
-    <w:lvl w:ilvl="6">
-      <w:numFmt w:val="bullet"/>
-      <w:lvlText w:val="•"/>
-      <w:lvlJc w:val="left"/>
-      <w:pPr>
-        <w:ind w:left="5040" w:hanging="480"/>
-      </w:pPr>
-    </w:lvl>
-    <w:lvl w:ilvl="7">
-      <w:numFmt w:val="bullet"/>
-      <w:lvlText w:val="–"/>
-      <w:lvlJc w:val="left"/>
-      <w:pPr>
-        <w:ind w:left="5760" w:hanging="480"/>
-      </w:pPr>
-    </w:lvl>
-    <w:lvl w:ilvl="8">
-      <w:numFmt w:val="bullet"/>
-      <w:lvlText w:val="•"/>
-      <w:lvlJc w:val="left"/>
-      <w:pPr>
-        <w:ind w:left="6480" w:hanging="480"/>
-      </w:pPr>
-    </w:lvl>
-  </w:abstractNum>
   <w:num w:numId="1000">
     <w:abstractNumId w:val="990"/>
   </w:num>
   <w:num w:numId="1001">
-    <w:abstractNumId w:val="99411"/>
-    <w:lvlOverride w:ilvl="0">
-      <w:startOverride w:val="1"/>
-    </w:lvlOverride>
-    <w:lvlOverride w:ilvl="1">
-      <w:startOverride w:val="1"/>
-    </w:lvlOverride>
-    <w:lvlOverride w:ilvl="2">
-      <w:startOverride w:val="1"/>
-    </w:lvlOverride>
-    <w:lvlOverride w:ilvl="3">
-      <w:startOverride w:val="1"/>
-    </w:lvlOverride>
-    <w:lvlOverride w:ilvl="4">
-      <w:startOverride w:val="1"/>
-    </w:lvlOverride>
-    <w:lvlOverride w:ilvl="5">
-      <w:startOverride w:val="1"/>
-    </w:lvlOverride>
-    <w:lvlOverride w:ilvl="6">
-      <w:startOverride w:val="1"/>
-    </w:lvlOverride>
-    <w:lvlOverride w:ilvl="7">
-      <w:startOverride w:val="1"/>
-    </w:lvlOverride>
-    <w:lvlOverride w:ilvl="8">
-      <w:startOverride w:val="1"/>
-    </w:lvlOverride>
+    <w:abstractNumId w:val="991"/>
   </w:num>
   <w:num w:numId="1002">
     <w:abstractNumId w:val="991"/>
   </w:num>
   <w:num w:numId="1003">
-    <w:abstractNumId w:val="99411"/>
-    <w:lvlOverride w:ilvl="0">
-      <w:startOverride w:val="1"/>
-    </w:lvlOverride>
-    <w:lvlOverride w:ilvl="1">
-      <w:startOverride w:val="1"/>
-    </w:lvlOverride>
-    <w:lvlOverride w:ilvl="2">
-      <w:startOverride w:val="1"/>
-    </w:lvlOverride>
-    <w:lvlOverride w:ilvl="3">
-      <w:startOverride w:val="1"/>
-    </w:lvlOverride>
-    <w:lvlOverride w:ilvl="4">
-      <w:startOverride w:val="1"/>
-    </w:lvlOverride>
-    <w:lvlOverride w:ilvl="5">
-      <w:startOverride w:val="1"/>
-    </w:lvlOverride>
-    <w:lvlOverride w:ilvl="6">
-      <w:startOverride w:val="1"/>
-    </w:lvlOverride>
-    <w:lvlOverride w:ilvl="7">
-      <w:startOverride w:val="1"/>
-    </w:lvlOverride>
-    <w:lvlOverride w:ilvl="8">
-      <w:startOverride w:val="1"/>
-    </w:lvlOverride>
+    <w:abstractNumId w:val="991"/>
   </w:num>
   <w:num w:numId="1004">
     <w:abstractNumId w:val="991"/>
@@ -6822,7 +7278,34 @@
     <w:abstractNumId w:val="991"/>
   </w:num>
   <w:num w:numId="1009">
-    <w:abstractNumId w:val="991"/>
+    <w:abstractNumId w:val="99411"/>
+    <w:lvlOverride w:ilvl="0">
+      <w:startOverride w:val="1"/>
+    </w:lvlOverride>
+    <w:lvlOverride w:ilvl="1">
+      <w:startOverride w:val="1"/>
+    </w:lvlOverride>
+    <w:lvlOverride w:ilvl="2">
+      <w:startOverride w:val="1"/>
+    </w:lvlOverride>
+    <w:lvlOverride w:ilvl="3">
+      <w:startOverride w:val="1"/>
+    </w:lvlOverride>
+    <w:lvlOverride w:ilvl="4">
+      <w:startOverride w:val="1"/>
+    </w:lvlOverride>
+    <w:lvlOverride w:ilvl="5">
+      <w:startOverride w:val="1"/>
+    </w:lvlOverride>
+    <w:lvlOverride w:ilvl="6">
+      <w:startOverride w:val="1"/>
+    </w:lvlOverride>
+    <w:lvlOverride w:ilvl="7">
+      <w:startOverride w:val="1"/>
+    </w:lvlOverride>
+    <w:lvlOverride w:ilvl="8">
+      <w:startOverride w:val="1"/>
+    </w:lvlOverride>
   </w:num>
   <w:num w:numId="1010">
     <w:abstractNumId w:val="991"/>
@@ -6834,9 +7317,54 @@
     <w:abstractNumId w:val="991"/>
   </w:num>
   <w:num w:numId="1013">
+    <w:abstractNumId w:val="99411"/>
+    <w:lvlOverride w:ilvl="0">
+      <w:startOverride w:val="1"/>
+    </w:lvlOverride>
+    <w:lvlOverride w:ilvl="1">
+      <w:startOverride w:val="1"/>
+    </w:lvlOverride>
+    <w:lvlOverride w:ilvl="2">
+      <w:startOverride w:val="1"/>
+    </w:lvlOverride>
+    <w:lvlOverride w:ilvl="3">
+      <w:startOverride w:val="1"/>
+    </w:lvlOverride>
+    <w:lvlOverride w:ilvl="4">
+      <w:startOverride w:val="1"/>
+    </w:lvlOverride>
+    <w:lvlOverride w:ilvl="5">
+      <w:startOverride w:val="1"/>
+    </w:lvlOverride>
+    <w:lvlOverride w:ilvl="6">
+      <w:startOverride w:val="1"/>
+    </w:lvlOverride>
+    <w:lvlOverride w:ilvl="7">
+      <w:startOverride w:val="1"/>
+    </w:lvlOverride>
+    <w:lvlOverride w:ilvl="8">
+      <w:startOverride w:val="1"/>
+    </w:lvlOverride>
+  </w:num>
+  <w:num w:numId="1014">
     <w:abstractNumId w:val="991"/>
   </w:num>
-  <w:num w:numId="1014">
+  <w:num w:numId="1015">
+    <w:abstractNumId w:val="991"/>
+  </w:num>
+  <w:num w:numId="1016">
+    <w:abstractNumId w:val="991"/>
+  </w:num>
+  <w:num w:numId="1017">
+    <w:abstractNumId w:val="991"/>
+  </w:num>
+  <w:num w:numId="1018">
+    <w:abstractNumId w:val="991"/>
+  </w:num>
+  <w:num w:numId="1019">
+    <w:abstractNumId w:val="991"/>
+  </w:num>
+  <w:num w:numId="1020">
     <w:abstractNumId w:val="99411"/>
     <w:lvlOverride w:ilvl="0">
       <w:startOverride w:val="1"/>

</xml_diff>